<commit_message>
Partner 'All my branches': a partner of several branches sees them combined - reports, exports, orders, shifts, stock, analytics and the watch list across exactly their branches, writes one branch at a time, older branch leaks for partners closed (A582, migration 171); Analytics Costs no longer slides the dashboard into a blank screen, an area that fails to load says so with Retry (A583); technician guide 1.4
</commit_message>
<xml_diff>
--- a/docs/setup/TECHNICIAN-SETUP-GUIDE.docx
+++ b/docs/setup/TECHNICIAN-SETUP-GUIDE.docx
@@ -19,7 +19,7 @@
           <w:i/>
           <w:iCs/>
         </w:rPr>
-        <w:t xml:space="preserve">Version 1.3 · 23 October 2026 · ZapTill 1.0.20 · for ZapTill field technicians</w:t>
+        <w:t xml:space="preserve">Version 1.4 · 23 October 2026 · ZapTill 1.0.20 · for ZapTill field technicians</w:t>
       </w:r>
     </w:p>
     <w:p>
@@ -257,7 +257,17 @@
         <w:t xml:space="preserve">Record payment</w:t>
       </w:r>
       <w:r>
-        <w:t xml:space="preserve">, and a client that stops paying keeps selling but stops syncing (Step 2b); plus the zero-stock setting, menus as tabs on the till, other branches' stock, barcodes and labels, and the approval PIN as a feature switch.</w:t>
+        <w:t xml:space="preserve">, and a client that stops paying keeps selling but stops syncing (Step 2b); a partner of some branches sees only theirs, with </w:t>
+      </w:r>
+      <w:r>
+        <w:rPr>
+          <w:b/>
+          <w:bCs/>
+        </w:rPr>
+        <w:t xml:space="preserve">All my branches</w:t>
+      </w:r>
+      <w:r>
+        <w:t xml:space="preserve"> to add them up (Step 5); plus the zero-stock setting, menus as tabs on the till, other branches' stock, barcodes and labels, and the approval PIN as a feature switch.</w:t>
       </w:r>
     </w:p>
     <w:p>
@@ -542,7 +552,7 @@
               </w:rPr>
               <w:t xml:space="preserve">Jane Wanjiru, </w:t>
             </w:r>
-            <w:hyperlink w:history="1" r:id="rIdcnefhxzf5zuakcuxe-rda">
+            <w:hyperlink w:history="1" r:id="rIdq7cbylb6tego8t6kkpbrb">
               <w:r>
                 <w:rPr>
                   <w:rStyle w:val="Hyperlink"/>
@@ -7424,7 +7434,7 @@
         <w:t xml:space="preserve">Manager › Stock › Other branches</w:t>
       </w:r>
       <w:r>
-        <w:t xml:space="preserve">. It shows quantities only, never costs. A manager with the stock transfer right can </w:t>
+        <w:t xml:space="preserve">. It shows quantities only, never costs. A partner of some branches sees only their own other branches. A manager with the stock transfer right can </w:t>
       </w:r>
       <w:r>
         <w:rPr>
@@ -8752,6 +8762,111 @@
       </w:r>
       <w:r>
         <w:t xml:space="preserve"> to remove it.</w:t>
+      </w:r>
+    </w:p>
+    <w:p>
+      <w:pPr>
+        <w:spacing w:after="120"/>
+      </w:pPr>
+      <w:r>
+        <w:rPr>
+          <w:b/>
+          <w:bCs/>
+        </w:rPr>
+        <w:t xml:space="preserve">Which branches a partner sees.</w:t>
+      </w:r>
+      <w:r>
+        <w:t xml:space="preserve"> A partner sees exactly the branches ticked on their staff record (none ticked means every branch). A partner of </w:t>
+      </w:r>
+      <w:r>
+        <w:rPr>
+          <w:b/>
+          <w:bCs/>
+        </w:rPr>
+        <w:t xml:space="preserve">every</w:t>
+      </w:r>
+      <w:r>
+        <w:t xml:space="preserve"> branch gets the owner's branch picker, </w:t>
+      </w:r>
+      <w:r>
+        <w:rPr>
+          <w:b/>
+          <w:bCs/>
+        </w:rPr>
+        <w:t xml:space="preserve">All Branches</w:t>
+      </w:r>
+      <w:r>
+        <w:t xml:space="preserve"> included. A partner of </w:t>
+      </w:r>
+      <w:r>
+        <w:rPr>
+          <w:b/>
+          <w:bCs/>
+        </w:rPr>
+        <w:t xml:space="preserve">some</w:t>
+      </w:r>
+      <w:r>
+        <w:t xml:space="preserve"> branches (for example a partner who owns shops X, Y and Z of a client's four) never sees </w:t>
+      </w:r>
+      <w:r>
+        <w:rPr>
+          <w:b/>
+          <w:bCs/>
+        </w:rPr>
+        <w:t xml:space="preserve">All Branches</w:t>
+      </w:r>
+      <w:r>
+        <w:t xml:space="preserve"> or any other branch's sales, stock, staff or name. With two or more branches their picker starts with </w:t>
+      </w:r>
+      <w:r>
+        <w:rPr>
+          <w:b/>
+          <w:bCs/>
+        </w:rPr>
+        <w:t xml:space="preserve">All my branches (3)</w:t>
+      </w:r>
+      <w:r>
+        <w:t xml:space="preserve">: every report, the Cockpit, orders, shifts, stock, the watch list and Analytics (with </w:t>
+      </w:r>
+      <w:r>
+        <w:rPr>
+          <w:b/>
+          <w:bCs/>
+        </w:rPr>
+        <w:t xml:space="preserve">Branches</w:t>
+      </w:r>
+      <w:r>
+        <w:t xml:space="preserve"> comparing their own) show their branches added together. A few screens work one branch at a time, such as the monthly pack, tables, the kitchen screen and eTIMS; there the page says </w:t>
+      </w:r>
+      <w:r>
+        <w:rPr>
+          <w:b/>
+          <w:bCs/>
+        </w:rPr>
+        <w:t xml:space="preserve">Pick one of your branches for this</w:t>
+      </w:r>
+      <w:r>
+        <w:t xml:space="preserve">. To record a sale, an expense, a count or any other change, they pick one of their branches first; in </w:t>
+      </w:r>
+      <w:r>
+        <w:rPr>
+          <w:b/>
+          <w:bCs/>
+        </w:rPr>
+        <w:t xml:space="preserve">All my branches</w:t>
+      </w:r>
+      <w:r>
+        <w:t xml:space="preserve"> the cloud refuses changes with the same words. Tick the partner's branches before you click </w:t>
+      </w:r>
+      <w:r>
+        <w:rPr>
+          <w:b/>
+          <w:bCs/>
+        </w:rPr>
+        <w:t xml:space="preserve">Give web access</w:t>
+      </w:r>
+      <w:r>
+        <w:t xml:space="preserve">.</w:t>
       </w:r>
     </w:p>
     <w:p>

</xml_diff>